<commit_message>
Replace legacy rules with latest manuscript baseline
</commit_message>
<xml_diff>
--- a/assets/SCI_manuscript_template.docx
+++ b/assets/SCI_manuscript_template.docx
@@ -4,8 +4,9 @@
   <w:body>
     <w:p>
       <w:pPr>
+        <w:pStyle w:val="Normal"/>
         <w:spacing w:line="360" w:lineRule="auto" w:before="120" w:after="0"/>
-        <w:ind w:firstLine="0" w:left="0" w:right="0"/>
+        <w:ind w:left="0" w:right="0" w:firstLine="0" w:hanging="0"/>
         <w:jc w:val="center"/>
       </w:pPr>
       <w:r>
@@ -15,170 +16,134 @@
           <w:color w:val="000000"/>
           <w:sz w:val="28"/>
         </w:rPr>
-        <w:t>[Insert manuscript title]</w:t>
+        <w:t>Manuscript title: replace with a concise, informative title</w:t>
       </w:r>
     </w:p>
     <w:p>
       <w:pPr>
+        <w:pStyle w:val="Normal"/>
         <w:spacing w:line="360" w:lineRule="auto" w:before="120" w:after="0"/>
-        <w:ind w:firstLine="0" w:left="0" w:right="0"/>
+        <w:ind w:left="0" w:right="0" w:firstLine="0" w:hanging="0"/>
         <w:jc w:val="center"/>
       </w:pPr>
       <w:r>
         <w:rPr>
           <w:rFonts w:ascii="Times New Roman" w:hAnsi="Times New Roman" w:eastAsia="Times New Roman" w:cs="Times New Roman"/>
+          <w:b w:val="0"/>
           <w:color w:val="000000"/>
           <w:sz w:val="24"/>
         </w:rPr>
-        <w:t>[Author 1]</w:t>
+        <w:t>First Author</w:t>
       </w:r>
       <w:r>
         <w:rPr>
           <w:rFonts w:ascii="Times New Roman" w:hAnsi="Times New Roman" w:eastAsia="Times New Roman" w:cs="Times New Roman"/>
+          <w:b w:val="0"/>
           <w:color w:val="000000"/>
           <w:sz w:val="24"/>
           <w:vertAlign w:val="superscript"/>
         </w:rPr>
-        <w:t>a</w:t>
+        <w:t>1</w:t>
       </w:r>
       <w:r>
         <w:rPr>
           <w:rFonts w:ascii="Times New Roman" w:hAnsi="Times New Roman" w:eastAsia="Times New Roman" w:cs="Times New Roman"/>
+          <w:b w:val="0"/>
           <w:color w:val="000000"/>
           <w:sz w:val="24"/>
         </w:rPr>
-        <w:t>, [Author 2]</w:t>
+        <w:t>, Second Author</w:t>
       </w:r>
       <w:r>
         <w:rPr>
           <w:rFonts w:ascii="Times New Roman" w:hAnsi="Times New Roman" w:eastAsia="Times New Roman" w:cs="Times New Roman"/>
+          <w:b w:val="0"/>
           <w:color w:val="000000"/>
           <w:sz w:val="24"/>
           <w:vertAlign w:val="superscript"/>
         </w:rPr>
-        <w:t>a,b</w:t>
-      </w:r>
-      <w:r>
-        <w:rPr>
-          <w:rFonts w:ascii="Times New Roman" w:hAnsi="Times New Roman" w:eastAsia="Times New Roman" w:cs="Times New Roman"/>
-          <w:color w:val="000000"/>
-          <w:sz w:val="24"/>
-        </w:rPr>
-        <w:t>, [Author 3]</w:t>
-      </w:r>
-      <w:r>
-        <w:rPr>
-          <w:rFonts w:ascii="Times New Roman" w:hAnsi="Times New Roman" w:eastAsia="Times New Roman" w:cs="Times New Roman"/>
-          <w:color w:val="000000"/>
-          <w:sz w:val="24"/>
-          <w:vertAlign w:val="superscript"/>
-        </w:rPr>
-        <w:t>c,*</w:t>
+        <w:t>2</w:t>
       </w:r>
     </w:p>
     <w:p>
       <w:pPr>
+        <w:pStyle w:val="Normal"/>
         <w:spacing w:line="360" w:lineRule="auto" w:before="120" w:after="0"/>
-        <w:ind w:firstLine="0" w:left="0" w:right="0"/>
+        <w:ind w:left="0" w:right="0" w:firstLine="0" w:hanging="0"/>
         <w:jc w:val="left"/>
       </w:pPr>
       <w:r>
         <w:rPr>
           <w:rFonts w:ascii="Times New Roman" w:hAnsi="Times New Roman" w:eastAsia="Times New Roman" w:cs="Times New Roman"/>
+          <w:b w:val="0"/>
           <w:color w:val="000000"/>
           <w:sz w:val="24"/>
           <w:vertAlign w:val="superscript"/>
         </w:rPr>
-        <w:t>a</w:t>
+        <w:t>1</w:t>
       </w:r>
       <w:r>
         <w:rPr>
           <w:rFonts w:ascii="Times New Roman" w:hAnsi="Times New Roman" w:eastAsia="Times New Roman" w:cs="Times New Roman"/>
+          <w:b w:val="0"/>
           <w:color w:val="000000"/>
           <w:sz w:val="24"/>
         </w:rPr>
-        <w:t xml:space="preserve"> [Affiliation 1, Department, Institution, City, Country]</w:t>
+        <w:t xml:space="preserve"> Department, Institution, City, Postal code, Country</w:t>
       </w:r>
     </w:p>
     <w:p>
       <w:pPr>
+        <w:pStyle w:val="Normal"/>
         <w:spacing w:line="360" w:lineRule="auto" w:before="120" w:after="0"/>
-        <w:ind w:firstLine="0" w:left="0" w:right="0"/>
+        <w:ind w:left="0" w:right="0" w:firstLine="0" w:hanging="0"/>
         <w:jc w:val="left"/>
       </w:pPr>
       <w:r>
         <w:rPr>
           <w:rFonts w:ascii="Times New Roman" w:hAnsi="Times New Roman" w:eastAsia="Times New Roman" w:cs="Times New Roman"/>
+          <w:b w:val="0"/>
           <w:color w:val="000000"/>
           <w:sz w:val="24"/>
           <w:vertAlign w:val="superscript"/>
         </w:rPr>
-        <w:t>b</w:t>
+        <w:t>2</w:t>
       </w:r>
       <w:r>
         <w:rPr>
           <w:rFonts w:ascii="Times New Roman" w:hAnsi="Times New Roman" w:eastAsia="Times New Roman" w:cs="Times New Roman"/>
+          <w:b w:val="0"/>
           <w:color w:val="000000"/>
           <w:sz w:val="24"/>
         </w:rPr>
-        <w:t xml:space="preserve"> [Affiliation 2, Department, Institution, City, Country]</w:t>
+        <w:t xml:space="preserve"> Department, Institution, City, Postal code, Country</w:t>
       </w:r>
     </w:p>
     <w:p>
       <w:pPr>
+        <w:pStyle w:val="Normal"/>
         <w:spacing w:line="360" w:lineRule="auto" w:before="120" w:after="0"/>
-        <w:ind w:firstLine="0" w:left="0" w:right="0"/>
+        <w:ind w:left="0" w:right="0" w:firstLine="0" w:hanging="0"/>
         <w:jc w:val="left"/>
       </w:pPr>
       <w:r>
         <w:rPr>
           <w:rFonts w:ascii="Times New Roman" w:hAnsi="Times New Roman" w:eastAsia="Times New Roman" w:cs="Times New Roman"/>
+          <w:b w:val="0"/>
           <w:color w:val="000000"/>
           <w:sz w:val="24"/>
-          <w:vertAlign w:val="superscript"/>
         </w:rPr>
-        <w:t>c</w:t>
+        <w:t xml:space="preserve">* Corresponding author: </w:t>
       </w:r>
       <w:r>
         <w:rPr>
           <w:rFonts w:ascii="Times New Roman" w:hAnsi="Times New Roman" w:eastAsia="Times New Roman" w:cs="Times New Roman"/>
+          <w:b w:val="0"/>
           <w:color w:val="000000"/>
-          <w:sz w:val="24"/>
-        </w:rPr>
-        <w:t xml:space="preserve"> [Affiliation 3, Department, Institution, City, Country]</w:t>
-      </w:r>
-    </w:p>
-    <w:p>
-      <w:pPr>
-        <w:spacing w:line="360" w:lineRule="auto" w:before="120" w:after="0"/>
-        <w:ind w:firstLine="0" w:left="0" w:right="0"/>
-        <w:jc w:val="left"/>
-      </w:pPr>
-      <w:r>
-        <w:rPr>
-          <w:rFonts w:ascii="Times New Roman" w:hAnsi="Times New Roman" w:eastAsia="Times New Roman" w:cs="Times New Roman"/>
-          <w:color w:val="000000"/>
-          <w:sz w:val="24"/>
-          <w:vertAlign w:val="superscript"/>
-        </w:rPr>
-        <w:t>*</w:t>
-      </w:r>
-      <w:r>
-        <w:rPr>
-          <w:rFonts w:ascii="Times New Roman" w:hAnsi="Times New Roman" w:eastAsia="Times New Roman" w:cs="Times New Roman"/>
-          <w:color w:val="000000"/>
-          <w:sz w:val="24"/>
-        </w:rPr>
-        <w:t xml:space="preserve"> Corresponding author: </w:t>
-      </w:r>
-      <w:r>
-        <w:rPr>
-          <w:rFonts w:ascii="Times New Roman" w:hAnsi="Times New Roman" w:eastAsia="Times New Roman" w:cs="Times New Roman"/>
-          <w:color w:val="0563C1"/>
           <w:sz w:val="24"/>
           <w:u w:val="single"/>
         </w:rPr>
-        <w:t>name@example.com</w:t>
+        <w:t>author@example.com</w:t>
       </w:r>
       <w:r>
         <w:br w:type="page"/>
@@ -187,8 +152,6 @@
     <w:p>
       <w:pPr>
         <w:pStyle w:val="Heading1"/>
-        <w:spacing w:before="50"/>
-        <w:ind w:firstLine="0" w:left="0" w:right="0"/>
       </w:pPr>
       <w:r>
         <w:t>Abstract</w:t>
@@ -196,16 +159,16 @@
     </w:p>
     <w:p>
       <w:pPr>
-        <w:pStyle w:val="SCIAbstractBody"/>
+        <w:pStyle w:val="Normal"/>
       </w:pPr>
       <w:r>
-        <w:t>[Insert the abstract. This paragraph uses the SCI Abstract Body style and the confirmed four-letter first-line indent.]</w:t>
+        <w:t>Replace this text with a self-contained abstract. This paragraph uses the Normal style: Times New Roman 12 pt, justified, 1.5 line spacing, 6 pt before and after, and no first-line indent.</w:t>
       </w:r>
     </w:p>
     <w:p>
       <w:pPr>
-        <w:spacing w:line="360" w:lineRule="auto" w:before="120" w:after="0"/>
-        <w:ind w:firstLine="0" w:left="0" w:right="0"/>
+        <w:pStyle w:val="Normal"/>
+        <w:ind w:left="0" w:right="0" w:firstLine="0" w:hanging="0"/>
         <w:jc w:val="left"/>
       </w:pPr>
       <w:r>
@@ -213,7 +176,7 @@
           <w:rFonts w:ascii="Times New Roman" w:hAnsi="Times New Roman" w:eastAsia="Times New Roman" w:cs="Times New Roman"/>
           <w:b/>
           <w:color w:val="000000"/>
-          <w:sz w:val="28"/>
+          <w:sz w:val="24"/>
         </w:rPr>
         <w:t xml:space="preserve">Keywords: </w:t>
       </w:r>
@@ -221,9 +184,9 @@
         <w:rPr>
           <w:rFonts w:ascii="Times New Roman" w:hAnsi="Times New Roman" w:eastAsia="Times New Roman" w:cs="Times New Roman"/>
           <w:color w:val="000000"/>
-          <w:sz w:val="28"/>
+          <w:sz w:val="24"/>
         </w:rPr>
-        <w:t>[keyword 1; keyword 2; keyword 3]</w:t>
+        <w:t>landslide; physical model; monitoring; deformation; uncertainty</w:t>
       </w:r>
       <w:r>
         <w:br w:type="page"/>
@@ -239,21 +202,21 @@
     </w:p>
     <w:p>
       <w:pPr>
-        <w:pStyle w:val="SCIBody"/>
+        <w:pStyle w:val="Normal"/>
       </w:pPr>
       <w:r>
         <w:rPr>
           <w:rFonts w:ascii="Times New Roman" w:hAnsi="Times New Roman" w:eastAsia="Times New Roman" w:cs="Times New Roman"/>
           <w:color w:val="000000"/>
-          <w:sz w:val="28"/>
+          <w:sz w:val="24"/>
         </w:rPr>
-        <w:t xml:space="preserve">[Insert manuscript text here. Preserve the source citation system, whether it uses author-year citations such as Smith (2024) or numeric citations such as </w:t>
+        <w:t xml:space="preserve">Replace this text with manuscript content. Preserve an author-year system such as Smith (2024), or retain an existing numeric citation such as </w:t>
       </w:r>
       <w:r>
         <w:rPr>
           <w:rFonts w:ascii="Times New Roman" w:hAnsi="Times New Roman" w:eastAsia="Times New Roman" w:cs="Times New Roman"/>
           <w:color w:val="000000"/>
-          <w:sz w:val="28"/>
+          <w:sz w:val="24"/>
           <w:vertAlign w:val="superscript"/>
         </w:rPr>
         <w:t>1</w:t>
@@ -262,9 +225,9 @@
         <w:rPr>
           <w:rFonts w:ascii="Times New Roman" w:hAnsi="Times New Roman" w:eastAsia="Times New Roman" w:cs="Times New Roman"/>
           <w:color w:val="000000"/>
-          <w:sz w:val="28"/>
+          <w:sz w:val="24"/>
         </w:rPr>
-        <w:t>.]</w:t>
+        <w:t xml:space="preserve"> without converting the manuscript from one system to another.</w:t>
       </w:r>
     </w:p>
     <w:p>
@@ -277,10 +240,26 @@
     </w:p>
     <w:p>
       <w:pPr>
-        <w:pStyle w:val="SCIBody"/>
+        <w:pStyle w:val="Normal"/>
       </w:pPr>
       <w:r>
-        <w:t>[Use SCI Body for ordinary narrative paragraphs. Replace all bracketed guidance before submission.]</w:t>
+        <w:t>Use Normal for ordinary narrative paragraphs. Replace all bracketed or instructional text before submission.</w:t>
+      </w:r>
+    </w:p>
+    <w:p>
+      <w:pPr>
+        <w:pStyle w:val="Heading3"/>
+      </w:pPr>
+      <w:r>
+        <w:t>1.1.1 Optional third-level heading</w:t>
+      </w:r>
+    </w:p>
+    <w:p>
+      <w:pPr>
+        <w:pStyle w:val="Normal"/>
+      </w:pPr>
+      <w:r>
+        <w:t>This paragraph confirms that all three heading levels and the Normal body style are available.</w:t>
       </w:r>
     </w:p>
     <w:p>
@@ -293,12 +272,12 @@
     </w:p>
     <w:p>
       <w:pPr>
-        <w:pStyle w:val="图片"/>
+        <w:pStyle w:val="Figure"/>
       </w:pPr>
       <w:r>
         <w:drawing>
           <wp:inline xmlns:a="http://schemas.openxmlformats.org/drawingml/2006/main" xmlns:pic="http://schemas.openxmlformats.org/drawingml/2006/picture">
-            <wp:extent cx="5731560" cy="3821040"/>
+            <wp:extent cx="5731200" cy="2750976"/>
             <wp:docPr id="1" name="Picture 1"/>
             <wp:cNvGraphicFramePr>
               <a:graphicFrameLocks noChangeAspect="1"/>
@@ -319,7 +298,7 @@
                   <pic:spPr>
                     <a:xfrm>
                       <a:off x="0" y="0"/>
-                      <a:ext cx="5731560" cy="3821040"/>
+                      <a:ext cx="5731200" cy="2750976"/>
                     </a:xfrm>
                     <a:prstGeom prst="rect"/>
                   </pic:spPr>
@@ -332,10 +311,10 @@
     </w:p>
     <w:p>
       <w:pPr>
-        <w:pStyle w:val="图片标题"/>
+        <w:pStyle w:val="FigureCaption"/>
       </w:pPr>
       <w:r>
-        <w:t>Figure 1. Replace this placeholder with the final inline figure and edit the caption.</w:t>
+        <w:t>Figure 1. Replace this placeholder with the final inline figure and retain this 12 pt italic, justified caption below the image.</w:t>
       </w:r>
     </w:p>
     <w:p>
@@ -348,7 +327,7 @@
     </w:p>
     <w:p>
       <w:pPr>
-        <w:pStyle w:val="表格标题"/>
+        <w:pStyle w:val="TableCaption"/>
       </w:pPr>
       <w:r>
         <w:t>Table 1. Illustrative physical-model test conditions and observed responses.</w:t>
@@ -356,20 +335,20 @@
     </w:p>
     <w:tbl>
       <w:tblPr>
-        <w:tblStyle w:val="SCIThree-LineTable"/>
+        <w:tblStyle w:val="Table"/>
         <w:tblW w:type="dxa" w:w="9026"/>
-        <w:jc w:val="left"/>
+        <w:jc w:val="center"/>
         <w:tblLayout w:type="fixed"/>
         <w:tblLook w:firstColumn="1" w:firstRow="1" w:lastColumn="0" w:lastRow="0" w:noHBand="0" w:noVBand="1" w:val="04A0"/>
+        <w:tblBorders>
+          <w:top w:val="single" w:color="000000" w:sz="8"/>
+          <w:left w:val="nil" w:color="000000" w:sz="0"/>
+          <w:bottom w:val="single" w:color="000000" w:sz="8"/>
+          <w:right w:val="nil" w:color="000000" w:sz="0"/>
+          <w:insideH w:val="nil" w:color="000000" w:sz="0"/>
+          <w:insideV w:val="nil" w:color="000000" w:sz="0"/>
+        </w:tblBorders>
         <w:tblInd w:w="0" w:type="dxa"/>
-        <w:tblBorders>
-          <w:top w:val="single" w:sz="8" w:color="000000"/>
-          <w:bottom w:val="single" w:sz="8" w:color="000000"/>
-          <w:start w:val="nil"/>
-          <w:end w:val="nil"/>
-          <w:insideH w:val="nil"/>
-          <w:insideV w:val="nil"/>
-        </w:tblBorders>
       </w:tblPr>
       <w:tblGrid>
         <w:gridCol w:w="1500"/>
@@ -379,18 +358,18 @@
       </w:tblGrid>
       <w:tr>
         <w:trPr>
+          <w:trHeight w:val="397" w:hRule="atLeast"/>
           <w:cantSplit/>
-          <w:trHeight w:val="397" w:hRule="atLeast"/>
-          <w:tblHeader/>
+          <w:tblHeader w:val="true"/>
         </w:trPr>
         <w:tc>
           <w:tcPr>
             <w:tcW w:type="dxa" w:w="1500"/>
             <w:tcMar>
               <w:top w:w="60" w:type="dxa"/>
-              <w:start w:w="80" w:type="dxa"/>
               <w:bottom w:w="60" w:type="dxa"/>
-              <w:end w:w="80" w:type="dxa"/>
+              <w:left w:w="80" w:type="dxa"/>
+              <w:right w:w="80" w:type="dxa"/>
             </w:tcMar>
             <w:vAlign w:val="center"/>
             <w:tcBorders>
@@ -400,7 +379,7 @@
           <w:p>
             <w:pPr>
               <w:spacing w:line="240" w:lineRule="auto" w:before="0" w:after="0"/>
-              <w:ind w:firstLine="0" w:left="0" w:right="0"/>
+              <w:ind w:left="0" w:right="0" w:firstLine="0" w:hanging="0"/>
               <w:jc w:val="center"/>
             </w:pPr>
             <w:r>
@@ -419,9 +398,9 @@
             <w:tcW w:type="dxa" w:w="3000"/>
             <w:tcMar>
               <w:top w:w="60" w:type="dxa"/>
-              <w:start w:w="80" w:type="dxa"/>
               <w:bottom w:w="60" w:type="dxa"/>
-              <w:end w:w="80" w:type="dxa"/>
+              <w:left w:w="80" w:type="dxa"/>
+              <w:right w:w="80" w:type="dxa"/>
             </w:tcMar>
             <w:vAlign w:val="center"/>
             <w:tcBorders>
@@ -431,7 +410,7 @@
           <w:p>
             <w:pPr>
               <w:spacing w:line="240" w:lineRule="auto" w:before="0" w:after="0"/>
-              <w:ind w:firstLine="0" w:left="0" w:right="0"/>
+              <w:ind w:left="0" w:right="0" w:firstLine="0" w:hanging="0"/>
               <w:jc w:val="center"/>
             </w:pPr>
             <w:r>
@@ -450,9 +429,9 @@
             <w:tcW w:type="dxa" w:w="2300"/>
             <w:tcMar>
               <w:top w:w="60" w:type="dxa"/>
-              <w:start w:w="80" w:type="dxa"/>
               <w:bottom w:w="60" w:type="dxa"/>
-              <w:end w:w="80" w:type="dxa"/>
+              <w:left w:w="80" w:type="dxa"/>
+              <w:right w:w="80" w:type="dxa"/>
             </w:tcMar>
             <w:vAlign w:val="center"/>
             <w:tcBorders>
@@ -462,7 +441,7 @@
           <w:p>
             <w:pPr>
               <w:spacing w:line="240" w:lineRule="auto" w:before="0" w:after="0"/>
-              <w:ind w:firstLine="0" w:left="0" w:right="0"/>
+              <w:ind w:left="0" w:right="0" w:firstLine="0" w:hanging="0"/>
               <w:jc w:val="center"/>
             </w:pPr>
             <w:r>
@@ -481,9 +460,9 @@
             <w:tcW w:type="dxa" w:w="2226"/>
             <w:tcMar>
               <w:top w:w="60" w:type="dxa"/>
-              <w:start w:w="80" w:type="dxa"/>
               <w:bottom w:w="60" w:type="dxa"/>
-              <w:end w:w="80" w:type="dxa"/>
+              <w:left w:w="80" w:type="dxa"/>
+              <w:right w:w="80" w:type="dxa"/>
             </w:tcMar>
             <w:vAlign w:val="center"/>
             <w:tcBorders>
@@ -493,7 +472,7 @@
           <w:p>
             <w:pPr>
               <w:spacing w:line="240" w:lineRule="auto" w:before="0" w:after="0"/>
-              <w:ind w:firstLine="0" w:left="0" w:right="0"/>
+              <w:ind w:left="0" w:right="0" w:firstLine="0" w:hanging="0"/>
               <w:jc w:val="center"/>
             </w:pPr>
             <w:r>
@@ -510,24 +489,24 @@
       </w:tr>
       <w:tr>
         <w:trPr>
+          <w:trHeight w:val="397" w:hRule="atLeast"/>
           <w:cantSplit/>
-          <w:trHeight w:val="397" w:hRule="atLeast"/>
         </w:trPr>
         <w:tc>
           <w:tcPr>
             <w:tcW w:type="dxa" w:w="1500"/>
             <w:tcMar>
               <w:top w:w="60" w:type="dxa"/>
-              <w:start w:w="80" w:type="dxa"/>
               <w:bottom w:w="60" w:type="dxa"/>
-              <w:end w:w="80" w:type="dxa"/>
+              <w:left w:w="80" w:type="dxa"/>
+              <w:right w:w="80" w:type="dxa"/>
             </w:tcMar>
             <w:vAlign w:val="center"/>
           </w:tcPr>
           <w:p>
             <w:pPr>
               <w:spacing w:line="240" w:lineRule="auto" w:before="0" w:after="0"/>
-              <w:ind w:firstLine="0" w:left="0" w:right="0"/>
+              <w:ind w:left="0" w:right="0" w:firstLine="0" w:hanging="0"/>
               <w:jc w:val="center"/>
             </w:pPr>
             <w:r>
@@ -546,16 +525,16 @@
             <w:tcW w:type="dxa" w:w="3000"/>
             <w:tcMar>
               <w:top w:w="60" w:type="dxa"/>
-              <w:start w:w="80" w:type="dxa"/>
               <w:bottom w:w="60" w:type="dxa"/>
-              <w:end w:w="80" w:type="dxa"/>
+              <w:left w:w="80" w:type="dxa"/>
+              <w:right w:w="80" w:type="dxa"/>
             </w:tcMar>
             <w:vAlign w:val="center"/>
           </w:tcPr>
           <w:p>
             <w:pPr>
               <w:spacing w:line="240" w:lineRule="auto" w:before="0" w:after="0"/>
-              <w:ind w:firstLine="0" w:left="0" w:right="0"/>
+              <w:ind w:left="0" w:right="0" w:firstLine="0" w:hanging="0"/>
               <w:jc w:val="left"/>
             </w:pPr>
             <w:r>
@@ -574,16 +553,16 @@
             <w:tcW w:type="dxa" w:w="2300"/>
             <w:tcMar>
               <w:top w:w="60" w:type="dxa"/>
-              <w:start w:w="80" w:type="dxa"/>
               <w:bottom w:w="60" w:type="dxa"/>
-              <w:end w:w="80" w:type="dxa"/>
+              <w:left w:w="80" w:type="dxa"/>
+              <w:right w:w="80" w:type="dxa"/>
             </w:tcMar>
             <w:vAlign w:val="center"/>
           </w:tcPr>
           <w:p>
             <w:pPr>
               <w:spacing w:line="240" w:lineRule="auto" w:before="0" w:after="0"/>
-              <w:ind w:firstLine="0" w:left="0" w:right="0"/>
+              <w:ind w:left="0" w:right="0" w:firstLine="0" w:hanging="0"/>
               <w:jc w:val="center"/>
             </w:pPr>
             <w:r>
@@ -602,16 +581,16 @@
             <w:tcW w:type="dxa" w:w="2226"/>
             <w:tcMar>
               <w:top w:w="60" w:type="dxa"/>
-              <w:start w:w="80" w:type="dxa"/>
               <w:bottom w:w="60" w:type="dxa"/>
-              <w:end w:w="80" w:type="dxa"/>
+              <w:left w:w="80" w:type="dxa"/>
+              <w:right w:w="80" w:type="dxa"/>
             </w:tcMar>
             <w:vAlign w:val="center"/>
           </w:tcPr>
           <w:p>
             <w:pPr>
               <w:spacing w:line="240" w:lineRule="auto" w:before="0" w:after="0"/>
-              <w:ind w:firstLine="0" w:left="0" w:right="0"/>
+              <w:ind w:left="0" w:right="0" w:firstLine="0" w:hanging="0"/>
               <w:jc w:val="center"/>
             </w:pPr>
             <w:r>
@@ -628,24 +607,24 @@
       </w:tr>
       <w:tr>
         <w:trPr>
+          <w:trHeight w:val="397" w:hRule="atLeast"/>
           <w:cantSplit/>
-          <w:trHeight w:val="397" w:hRule="atLeast"/>
         </w:trPr>
         <w:tc>
           <w:tcPr>
             <w:tcW w:type="dxa" w:w="1500"/>
             <w:tcMar>
               <w:top w:w="60" w:type="dxa"/>
-              <w:start w:w="80" w:type="dxa"/>
               <w:bottom w:w="60" w:type="dxa"/>
-              <w:end w:w="80" w:type="dxa"/>
+              <w:left w:w="80" w:type="dxa"/>
+              <w:right w:w="80" w:type="dxa"/>
             </w:tcMar>
             <w:vAlign w:val="center"/>
           </w:tcPr>
           <w:p>
             <w:pPr>
               <w:spacing w:line="240" w:lineRule="auto" w:before="0" w:after="0"/>
-              <w:ind w:firstLine="0" w:left="0" w:right="0"/>
+              <w:ind w:left="0" w:right="0" w:firstLine="0" w:hanging="0"/>
               <w:jc w:val="center"/>
             </w:pPr>
             <w:r>
@@ -664,16 +643,16 @@
             <w:tcW w:type="dxa" w:w="3000"/>
             <w:tcMar>
               <w:top w:w="60" w:type="dxa"/>
-              <w:start w:w="80" w:type="dxa"/>
               <w:bottom w:w="60" w:type="dxa"/>
-              <w:end w:w="80" w:type="dxa"/>
+              <w:left w:w="80" w:type="dxa"/>
+              <w:right w:w="80" w:type="dxa"/>
             </w:tcMar>
             <w:vAlign w:val="center"/>
           </w:tcPr>
           <w:p>
             <w:pPr>
               <w:spacing w:line="240" w:lineRule="auto" w:before="0" w:after="0"/>
-              <w:ind w:firstLine="0" w:left="0" w:right="0"/>
+              <w:ind w:left="0" w:right="0" w:firstLine="0" w:hanging="0"/>
               <w:jc w:val="left"/>
             </w:pPr>
             <w:r>
@@ -692,16 +671,16 @@
             <w:tcW w:type="dxa" w:w="2300"/>
             <w:tcMar>
               <w:top w:w="60" w:type="dxa"/>
-              <w:start w:w="80" w:type="dxa"/>
               <w:bottom w:w="60" w:type="dxa"/>
-              <w:end w:w="80" w:type="dxa"/>
+              <w:left w:w="80" w:type="dxa"/>
+              <w:right w:w="80" w:type="dxa"/>
             </w:tcMar>
             <w:vAlign w:val="center"/>
           </w:tcPr>
           <w:p>
             <w:pPr>
               <w:spacing w:line="240" w:lineRule="auto" w:before="0" w:after="0"/>
-              <w:ind w:firstLine="0" w:left="0" w:right="0"/>
+              <w:ind w:left="0" w:right="0" w:firstLine="0" w:hanging="0"/>
               <w:jc w:val="center"/>
             </w:pPr>
             <w:r>
@@ -720,16 +699,16 @@
             <w:tcW w:type="dxa" w:w="2226"/>
             <w:tcMar>
               <w:top w:w="60" w:type="dxa"/>
-              <w:start w:w="80" w:type="dxa"/>
               <w:bottom w:w="60" w:type="dxa"/>
-              <w:end w:w="80" w:type="dxa"/>
+              <w:left w:w="80" w:type="dxa"/>
+              <w:right w:w="80" w:type="dxa"/>
             </w:tcMar>
             <w:vAlign w:val="center"/>
           </w:tcPr>
           <w:p>
             <w:pPr>
               <w:spacing w:line="240" w:lineRule="auto" w:before="0" w:after="0"/>
-              <w:ind w:firstLine="0" w:left="0" w:right="0"/>
+              <w:ind w:left="0" w:right="0" w:firstLine="0" w:hanging="0"/>
               <w:jc w:val="center"/>
             </w:pPr>
             <w:r>
@@ -746,24 +725,24 @@
       </w:tr>
       <w:tr>
         <w:trPr>
+          <w:trHeight w:val="397" w:hRule="atLeast"/>
           <w:cantSplit/>
-          <w:trHeight w:val="397" w:hRule="atLeast"/>
         </w:trPr>
         <w:tc>
           <w:tcPr>
             <w:tcW w:type="dxa" w:w="1500"/>
             <w:tcMar>
               <w:top w:w="60" w:type="dxa"/>
-              <w:start w:w="80" w:type="dxa"/>
               <w:bottom w:w="60" w:type="dxa"/>
-              <w:end w:w="80" w:type="dxa"/>
+              <w:left w:w="80" w:type="dxa"/>
+              <w:right w:w="80" w:type="dxa"/>
             </w:tcMar>
             <w:vAlign w:val="center"/>
           </w:tcPr>
           <w:p>
             <w:pPr>
               <w:spacing w:line="240" w:lineRule="auto" w:before="0" w:after="0"/>
-              <w:ind w:firstLine="0" w:left="0" w:right="0"/>
+              <w:ind w:left="0" w:right="0" w:firstLine="0" w:hanging="0"/>
               <w:jc w:val="center"/>
             </w:pPr>
             <w:r>
@@ -782,16 +761,16 @@
             <w:tcW w:type="dxa" w:w="3000"/>
             <w:tcMar>
               <w:top w:w="60" w:type="dxa"/>
-              <w:start w:w="80" w:type="dxa"/>
               <w:bottom w:w="60" w:type="dxa"/>
-              <w:end w:w="80" w:type="dxa"/>
+              <w:left w:w="80" w:type="dxa"/>
+              <w:right w:w="80" w:type="dxa"/>
             </w:tcMar>
             <w:vAlign w:val="center"/>
           </w:tcPr>
           <w:p>
             <w:pPr>
               <w:spacing w:line="240" w:lineRule="auto" w:before="0" w:after="0"/>
-              <w:ind w:firstLine="0" w:left="0" w:right="0"/>
+              <w:ind w:left="0" w:right="0" w:firstLine="0" w:hanging="0"/>
               <w:jc w:val="left"/>
             </w:pPr>
             <w:r>
@@ -810,16 +789,16 @@
             <w:tcW w:type="dxa" w:w="2300"/>
             <w:tcMar>
               <w:top w:w="60" w:type="dxa"/>
-              <w:start w:w="80" w:type="dxa"/>
               <w:bottom w:w="60" w:type="dxa"/>
-              <w:end w:w="80" w:type="dxa"/>
+              <w:left w:w="80" w:type="dxa"/>
+              <w:right w:w="80" w:type="dxa"/>
             </w:tcMar>
             <w:vAlign w:val="center"/>
           </w:tcPr>
           <w:p>
             <w:pPr>
               <w:spacing w:line="240" w:lineRule="auto" w:before="0" w:after="0"/>
-              <w:ind w:firstLine="0" w:left="0" w:right="0"/>
+              <w:ind w:left="0" w:right="0" w:firstLine="0" w:hanging="0"/>
               <w:jc w:val="center"/>
             </w:pPr>
             <w:r>
@@ -838,16 +817,16 @@
             <w:tcW w:type="dxa" w:w="2226"/>
             <w:tcMar>
               <w:top w:w="60" w:type="dxa"/>
-              <w:start w:w="80" w:type="dxa"/>
               <w:bottom w:w="60" w:type="dxa"/>
-              <w:end w:w="80" w:type="dxa"/>
+              <w:left w:w="80" w:type="dxa"/>
+              <w:right w:w="80" w:type="dxa"/>
             </w:tcMar>
             <w:vAlign w:val="center"/>
           </w:tcPr>
           <w:p>
             <w:pPr>
               <w:spacing w:line="240" w:lineRule="auto" w:before="0" w:after="0"/>
-              <w:ind w:firstLine="0" w:left="0" w:right="0"/>
+              <w:ind w:left="0" w:right="0" w:firstLine="0" w:hanging="0"/>
               <w:jc w:val="center"/>
             </w:pPr>
             <w:r>
@@ -873,10 +852,10 @@
     </w:p>
     <w:p>
       <w:pPr>
-        <w:pStyle w:val="SCIBody"/>
+        <w:pStyle w:val="Normal"/>
       </w:pPr>
       <w:r>
-        <w:t>[Use native editable Word equations for mathematical expressions that require equation typesetting.]</w:t>
+        <w:t>Use native editable Word equations for mathematical expressions that require equation typesetting.</w:t>
       </w:r>
     </w:p>
     <w:p>
@@ -887,7 +866,7 @@
         <w:rPr>
           <w:rFonts w:ascii="Times New Roman" w:hAnsi="Times New Roman" w:eastAsia="Times New Roman" w:cs="Times New Roman"/>
           <w:color w:val="000000"/>
-          <w:sz w:val="28"/>
+          <w:sz w:val="24"/>
         </w:rPr>
         <w:tab/>
       </w:r>
@@ -924,7 +903,7 @@
         <w:rPr>
           <w:rFonts w:ascii="Times New Roman" w:hAnsi="Times New Roman" w:eastAsia="Times New Roman" w:cs="Times New Roman"/>
           <w:color w:val="000000"/>
-          <w:sz w:val="28"/>
+          <w:sz w:val="24"/>
         </w:rPr>
         <w:tab/>
       </w:r>
@@ -932,7 +911,7 @@
         <w:rPr>
           <w:rFonts w:ascii="Times New Roman" w:hAnsi="Times New Roman" w:eastAsia="Times New Roman" w:cs="Times New Roman"/>
           <w:color w:val="000000"/>
-          <w:sz w:val="28"/>
+          <w:sz w:val="24"/>
         </w:rPr>
         <w:t>(1)</w:t>
       </w:r>
@@ -950,7 +929,7 @@
         <w:pStyle w:val="Reference"/>
       </w:pPr>
       <w:r>
-        <w:t>[Reference entry 1 - preserve its original position, numbering, punctuation, and citation mapping.]</w:t>
+        <w:t>Zhao, B. (2022). First source-position example; preserve this position and its citation mapping.</w:t>
       </w:r>
     </w:p>
     <w:p>
@@ -958,7 +937,7 @@
         <w:pStyle w:val="Reference"/>
       </w:pPr>
       <w:r>
-        <w:t>[Reference entry 2 - do not alphabetize, reorder, or renumber unless explicitly requested.]</w:t>
+        <w:t>Adams, C. (2024). Second source-position example; do not alphabetize, reorder, or renumber automatically.</w:t>
       </w:r>
     </w:p>
     <w:p>
@@ -971,10 +950,10 @@
     </w:p>
     <w:p>
       <w:pPr>
-        <w:pStyle w:val="SCIStatementBody"/>
+        <w:pStyle w:val="Normal"/>
       </w:pPr>
       <w:r>
-        <w:t>[Insert acknowledgments.]</w:t>
+        <w:t>Replace with acknowledgments.</w:t>
       </w:r>
     </w:p>
     <w:p>
@@ -987,10 +966,58 @@
     </w:p>
     <w:p>
       <w:pPr>
-        <w:pStyle w:val="SCIStatementBody"/>
+        <w:pStyle w:val="Normal"/>
       </w:pPr>
       <w:r>
-        <w:t>[Insert funding information.]</w:t>
+        <w:t>Replace with funding information.</w:t>
+      </w:r>
+    </w:p>
+    <w:p>
+      <w:pPr>
+        <w:pStyle w:val="Heading1"/>
+      </w:pPr>
+      <w:r>
+        <w:t>Competing interests</w:t>
+      </w:r>
+    </w:p>
+    <w:p>
+      <w:pPr>
+        <w:pStyle w:val="Normal"/>
+      </w:pPr>
+      <w:r>
+        <w:t>Replace with a competing-interest statement.</w:t>
+      </w:r>
+    </w:p>
+    <w:p>
+      <w:pPr>
+        <w:pStyle w:val="Heading1"/>
+      </w:pPr>
+      <w:r>
+        <w:t>Data availability</w:t>
+      </w:r>
+    </w:p>
+    <w:p>
+      <w:pPr>
+        <w:pStyle w:val="Normal"/>
+      </w:pPr>
+      <w:r>
+        <w:t>Replace with a data-availability statement.</w:t>
+      </w:r>
+    </w:p>
+    <w:p>
+      <w:pPr>
+        <w:pStyle w:val="Heading1"/>
+      </w:pPr>
+      <w:r>
+        <w:t>Ethics statement</w:t>
+      </w:r>
+    </w:p>
+    <w:p>
+      <w:pPr>
+        <w:pStyle w:val="Normal"/>
+      </w:pPr>
+      <w:r>
+        <w:t>Replace with an ethics statement when applicable.</w:t>
       </w:r>
     </w:p>
     <w:p>
@@ -1003,58 +1030,24 @@
     </w:p>
     <w:p>
       <w:pPr>
-        <w:pStyle w:val="SCIStatementBody"/>
+        <w:pStyle w:val="Normal"/>
       </w:pPr>
       <w:r>
-        <w:t>[Insert author contributions; author names may be bold.]</w:t>
+        <w:rPr>
+          <w:rFonts w:ascii="Times New Roman" w:hAnsi="Times New Roman" w:eastAsia="Times New Roman" w:cs="Times New Roman"/>
+          <w:b/>
+          <w:color w:val="000000"/>
+          <w:sz w:val="24"/>
+        </w:rPr>
+        <w:t xml:space="preserve">First Author: </w:t>
       </w:r>
-    </w:p>
-    <w:p>
-      <w:pPr>
-        <w:pStyle w:val="Heading1"/>
-      </w:pPr>
       <w:r>
-        <w:t>Competing interests</w:t>
-      </w:r>
-    </w:p>
-    <w:p>
-      <w:pPr>
-        <w:pStyle w:val="SCIStatementBody"/>
-      </w:pPr>
-      <w:r>
-        <w:t>[Insert competing-interest statement.]</w:t>
-      </w:r>
-    </w:p>
-    <w:p>
-      <w:pPr>
-        <w:pStyle w:val="Heading1"/>
-      </w:pPr>
-      <w:r>
-        <w:t>Data availability</w:t>
-      </w:r>
-    </w:p>
-    <w:p>
-      <w:pPr>
-        <w:pStyle w:val="SCIStatementBody"/>
-      </w:pPr>
-      <w:r>
-        <w:t>[Insert data-availability statement.]</w:t>
-      </w:r>
-    </w:p>
-    <w:p>
-      <w:pPr>
-        <w:pStyle w:val="Heading1"/>
-      </w:pPr>
-      <w:r>
-        <w:t>Ethics statement</w:t>
-      </w:r>
-    </w:p>
-    <w:p>
-      <w:pPr>
-        <w:pStyle w:val="SCIStatementBody"/>
-      </w:pPr>
-      <w:r>
-        <w:t>[Insert ethics statement when applicable.]</w:t>
+        <w:rPr>
+          <w:rFonts w:ascii="Times New Roman" w:hAnsi="Times New Roman" w:eastAsia="Times New Roman" w:cs="Times New Roman"/>
+          <w:color w:val="000000"/>
+          <w:sz w:val="24"/>
+        </w:rPr>
+        <w:t>Conceptualization, Methodology, Writing – original draft.</w:t>
       </w:r>
     </w:p>
     <w:sectPr>
@@ -1062,9 +1055,9 @@
       <w:footerReference w:type="default" r:id="rId10"/>
       <w:pgSz w:w="11906" w:h="16838"/>
       <w:pgMar w:top="1440" w:right="1440" w:bottom="1440" w:left="1440" w:header="720" w:footer="720" w:gutter="0"/>
-      <w:lnNumType w:countBy="1" w:start="0" w:distance="360" w:restart="continuous"/>
       <w:cols w:space="720"/>
       <w:docGrid w:linePitch="360"/>
+      <w:lnNumType w:countBy="1" w:start="0" w:restart="continuous" w:distance="360"/>
     </w:sectPr>
   </w:body>
 </w:document>
@@ -1075,13 +1068,14 @@
   <w:p>
     <w:pPr>
       <w:pStyle w:val="Footer"/>
-      <w:jc w:val="left"/>
+      <w:ind w:left="0" w:right="0" w:firstLine="0" w:hanging="0"/>
+      <w:jc w:val="center"/>
     </w:pPr>
     <w:r>
       <w:rPr>
         <w:rFonts w:ascii="Times New Roman" w:hAnsi="Times New Roman" w:eastAsia="Times New Roman" w:cs="Times New Roman"/>
         <w:color w:val="000000"/>
-        <w:sz w:val="22"/>
+        <w:sz w:val="24"/>
       </w:rPr>
       <w:fldChar w:fldCharType="begin"/>
       <w:instrText xml:space="preserve"> PAGE </w:instrText>
@@ -1467,14 +1461,16 @@
     <w:qFormat/>
     <w:rsid w:val="00FC693F"/>
     <w:pPr>
-      <w:spacing w:line="360" w:lineRule="auto" w:before="120" w:after="0"/>
-      <w:ind w:firstLine="0" w:left="0" w:right="0"/>
+      <w:spacing w:line="360" w:lineRule="auto" w:before="120" w:after="120"/>
+      <w:ind w:left="0" w:right="0" w:firstLine="0" w:hanging="0"/>
       <w:jc w:val="both"/>
     </w:pPr>
     <w:rPr>
       <w:rFonts w:ascii="Times New Roman" w:hAnsi="Times New Roman" w:eastAsia="Times New Roman" w:cs="Times New Roman"/>
+      <w:b w:val="0"/>
+      <w:i w:val="0"/>
       <w:color w:val="000000"/>
-      <w:sz w:val="28"/>
+      <w:sz w:val="24"/>
     </w:rPr>
   </w:style>
   <w:style w:type="paragraph" w:styleId="Header">
@@ -1533,7 +1529,7 @@
       <w:keepNext/>
       <w:keepLines/>
       <w:spacing w:before="120" w:after="0" w:line="360" w:lineRule="auto"/>
-      <w:ind w:firstLine="0" w:left="0" w:right="0"/>
+      <w:ind w:left="0" w:right="0" w:firstLine="0" w:hanging="0"/>
       <w:jc w:val="left"/>
       <w:outlineLvl w:val="0"/>
     </w:pPr>
@@ -1559,7 +1555,7 @@
       <w:keepNext/>
       <w:keepLines/>
       <w:spacing w:before="120" w:after="0" w:line="360" w:lineRule="auto"/>
-      <w:ind w:firstLine="0" w:left="0" w:right="0"/>
+      <w:ind w:left="0" w:right="0" w:firstLine="0" w:hanging="0"/>
       <w:jc w:val="left"/>
       <w:outlineLvl w:val="1"/>
     </w:pPr>
@@ -1585,7 +1581,7 @@
       <w:keepNext/>
       <w:keepLines/>
       <w:spacing w:before="120" w:after="0" w:line="360" w:lineRule="auto"/>
-      <w:ind w:firstLine="0" w:left="0" w:right="0"/>
+      <w:ind w:left="0" w:right="0" w:firstLine="0" w:hanging="0"/>
       <w:jc w:val="left"/>
       <w:outlineLvl w:val="2"/>
     </w:pPr>
@@ -13167,76 +13163,28 @@
       </w:tcPr>
     </w:tblStylePr>
   </w:style>
-  <w:style w:type="paragraph" w:customStyle="1" w:styleId="SCIBody">
-    <w:name w:val="SCI Body"/>
+  <w:style w:type="paragraph" w:customStyle="1" w:styleId="Figure">
+    <w:name w:val="Figure"/>
     <w:qFormat/>
     <w:pPr>
-      <w:spacing w:line="360" w:lineRule="auto" w:before="120" w:after="0"/>
-      <w:ind w:firstLine="560" w:left="0" w:right="0"/>
-      <w:jc w:val="both"/>
+      <w:spacing w:line="240" w:lineRule="auto" w:before="120" w:after="0"/>
+      <w:ind w:left="0" w:right="0" w:firstLine="0" w:hanging="0"/>
+      <w:jc w:val="center"/>
     </w:pPr>
     <w:rPr>
       <w:rFonts w:ascii="Times New Roman" w:hAnsi="Times New Roman" w:eastAsia="Times New Roman" w:cs="Times New Roman"/>
       <w:b w:val="0"/>
       <w:i w:val="0"/>
       <w:color w:val="000000"/>
-      <w:sz w:val="28"/>
+      <w:sz w:val="24"/>
     </w:rPr>
   </w:style>
-  <w:style w:type="paragraph" w:customStyle="1" w:styleId="SCIAbstractBody">
-    <w:name w:val="SCI Abstract Body"/>
+  <w:style w:type="paragraph" w:customStyle="1" w:styleId="FigureCaption">
+    <w:name w:val="Figure Caption"/>
     <w:qFormat/>
     <w:pPr>
-      <w:spacing w:line="360" w:lineRule="auto" w:before="120" w:after="0"/>
-      <w:ind w:firstLine="560" w:left="0" w:right="0"/>
-      <w:jc w:val="both"/>
-    </w:pPr>
-    <w:rPr>
-      <w:rFonts w:ascii="Times New Roman" w:hAnsi="Times New Roman" w:eastAsia="Times New Roman" w:cs="Times New Roman"/>
-      <w:b w:val="0"/>
-      <w:i w:val="0"/>
-      <w:color w:val="000000"/>
-      <w:sz w:val="28"/>
-    </w:rPr>
-  </w:style>
-  <w:style w:type="paragraph" w:customStyle="1" w:styleId="SCIStatementBody">
-    <w:name w:val="SCI Statement Body"/>
-    <w:qFormat/>
-    <w:pPr>
-      <w:spacing w:line="360" w:lineRule="auto" w:before="120" w:after="0"/>
-      <w:ind w:firstLine="560" w:left="0" w:right="0"/>
-      <w:jc w:val="both"/>
-    </w:pPr>
-    <w:rPr>
-      <w:rFonts w:ascii="Times New Roman" w:hAnsi="Times New Roman" w:eastAsia="Times New Roman" w:cs="Times New Roman"/>
-      <w:b w:val="0"/>
-      <w:i w:val="0"/>
-      <w:color w:val="000000"/>
-      <w:sz w:val="28"/>
-    </w:rPr>
-  </w:style>
-  <w:style w:type="paragraph" w:customStyle="1" w:styleId="图片">
-    <w:name w:val="图片"/>
-    <w:qFormat/>
-    <w:pPr>
-      <w:spacing w:line="240" w:lineRule="auto" w:before="120" w:after="0"/>
-      <w:ind w:firstLine="0" w:left="0" w:right="0"/>
-      <w:jc w:val="center"/>
-    </w:pPr>
-    <w:rPr>
-      <w:rFonts w:ascii="Times New Roman" w:hAnsi="Times New Roman" w:eastAsia="Times New Roman" w:cs="Times New Roman"/>
-      <w:b w:val="0"/>
-      <w:i w:val="0"/>
-      <w:color w:val="000000"/>
-      <w:sz w:val="28"/>
-    </w:rPr>
-  </w:style>
-  <w:style w:type="paragraph" w:customStyle="1" w:styleId="图片标题">
-    <w:name w:val="图片标题"/>
-    <w:qFormat/>
-    <w:pPr>
       <w:spacing w:line="360" w:lineRule="auto" w:before="0" w:after="120"/>
-      <w:ind w:firstLine="0" w:left="0" w:right="0"/>
+      <w:ind w:left="0" w:right="0" w:firstLine="0" w:hanging="0"/>
       <w:jc w:val="both"/>
     </w:pPr>
     <w:rPr>
@@ -13247,12 +13195,12 @@
       <w:sz w:val="24"/>
     </w:rPr>
   </w:style>
-  <w:style w:type="paragraph" w:customStyle="1" w:styleId="表格标题">
-    <w:name w:val="表格标题"/>
+  <w:style w:type="paragraph" w:customStyle="1" w:styleId="TableCaption">
+    <w:name w:val="Table Caption"/>
     <w:qFormat/>
     <w:pPr>
       <w:spacing w:line="360" w:lineRule="auto" w:before="120" w:after="0"/>
-      <w:ind w:firstLine="0" w:left="0" w:right="0"/>
+      <w:ind w:left="0" w:right="0" w:firstLine="0" w:hanging="0"/>
       <w:jc w:val="left"/>
     </w:pPr>
     <w:rPr>
@@ -13271,8 +13219,8 @@
         <w:tab w:pos="4513" w:val="center"/>
         <w:tab w:pos="9026" w:val="right"/>
       </w:tabs>
-      <w:spacing w:line="240" w:lineRule="auto" w:before="0" w:after="0"/>
-      <w:ind w:firstLine="0" w:left="0" w:right="0"/>
+      <w:spacing w:line="240" w:lineRule="auto" w:before="120" w:after="120"/>
+      <w:ind w:left="0" w:right="0" w:firstLine="0" w:hanging="0"/>
       <w:jc w:val="left"/>
     </w:pPr>
     <w:rPr>
@@ -13280,7 +13228,7 @@
       <w:b w:val="0"/>
       <w:i w:val="0"/>
       <w:color w:val="000000"/>
-      <w:sz w:val="28"/>
+      <w:sz w:val="24"/>
     </w:rPr>
   </w:style>
   <w:style w:type="paragraph" w:customStyle="1" w:styleId="Reference">
@@ -13288,7 +13236,7 @@
     <w:qFormat/>
     <w:pPr>
       <w:spacing w:line="240" w:lineRule="auto" w:before="0" w:after="60"/>
-      <w:ind w:hanging="720" w:left="720" w:right="0"/>
+      <w:ind w:left="720" w:right="0" w:hanging="720"/>
       <w:jc w:val="left"/>
     </w:pPr>
     <w:rPr>
@@ -13299,24 +13247,27 @@
       <w:sz w:val="22"/>
     </w:rPr>
   </w:style>
-  <w:style w:type="character" w:customStyle="1" w:styleId="LineNumber">
-    <w:name w:val="Line Number"/>
+  <w:style w:type="table" w:customStyle="1" w:styleId="Table">
+    <w:name w:val="Table"/>
     <w:qFormat/>
+    <w:rPr>
+      <w:rFonts w:ascii="Times New Roman" w:hAnsi="Times New Roman" w:eastAsia="Times New Roman" w:cs="Times New Roman"/>
+      <w:color w:val="000000"/>
+      <w:sz w:val="20"/>
+    </w:rPr>
+  </w:style>
+  <w:style w:type="character" w:styleId="LineNumber">
+    <w:name w:val="line number"/>
+    <w:basedOn w:val="DefaultParagraphFont"/>
+    <w:uiPriority w:val="99"/>
+    <w:semiHidden/>
+    <w:unhideWhenUsed/>
     <w:rPr>
       <w:rFonts w:ascii="Times New Roman" w:hAnsi="Times New Roman" w:eastAsia="Times New Roman" w:cs="Times New Roman"/>
       <w:b w:val="0"/>
       <w:i w:val="0"/>
       <w:color w:val="000000"/>
       <w:sz w:val="22"/>
-    </w:rPr>
-  </w:style>
-  <w:style w:type="table" w:customStyle="1" w:styleId="SCIThree-LineTable">
-    <w:name w:val="SCI Three-Line Table"/>
-    <w:qFormat/>
-    <w:rPr>
-      <w:rFonts w:ascii="Times New Roman" w:hAnsi="Times New Roman" w:eastAsia="Times New Roman" w:cs="Times New Roman"/>
-      <w:color w:val="000000"/>
-      <w:sz w:val="20"/>
     </w:rPr>
   </w:style>
 </w:styles>

</xml_diff>

<commit_message>
Set body indent and enforce Times New Roman headings
</commit_message>
<xml_diff>
--- a/assets/SCI_manuscript_template.docx
+++ b/assets/SCI_manuscript_template.docx
@@ -160,6 +160,7 @@
     <w:p>
       <w:pPr>
         <w:pStyle w:val="Normal"/>
+        <w:ind w:left="0" w:right="0" w:firstLine="0" w:hanging="0"/>
       </w:pPr>
       <w:r>
         <w:t>Replace this text with a self-contained abstract. This paragraph uses the Normal style: Times New Roman 12 pt, justified, 1.5 line spacing, 6 pt before and after, and no first-line indent.</w:t>
@@ -210,7 +211,7 @@
           <w:color w:val="000000"/>
           <w:sz w:val="24"/>
         </w:rPr>
-        <w:t xml:space="preserve">Replace this text with manuscript content. Preserve an author-year system such as Smith (2024), or retain an existing numeric citation such as </w:t>
+        <w:t xml:space="preserve">Replace with manuscript text. Preserve an author-year system such as Smith (2024), or an existing numeric citation such as </w:t>
       </w:r>
       <w:r>
         <w:rPr>
@@ -227,7 +228,7 @@
           <w:color w:val="000000"/>
           <w:sz w:val="24"/>
         </w:rPr>
-        <w:t xml:space="preserve"> without converting the manuscript from one system to another.</w:t>
+        <w:t>.</w:t>
       </w:r>
     </w:p>
     <w:p>
@@ -243,7 +244,7 @@
         <w:pStyle w:val="Normal"/>
       </w:pPr>
       <w:r>
-        <w:t>Use Normal for ordinary narrative paragraphs. Replace all bracketed or instructional text before submission.</w:t>
+        <w:t>Use Normal for ordinary narrative paragraphs.</w:t>
       </w:r>
     </w:p>
     <w:p>
@@ -259,7 +260,7 @@
         <w:pStyle w:val="Normal"/>
       </w:pPr>
       <w:r>
-        <w:t>This paragraph confirms that all three heading levels and the Normal body style are available.</w:t>
+        <w:t>All three heading levels use Times New Roman.</w:t>
       </w:r>
     </w:p>
     <w:p>
@@ -1462,7 +1463,7 @@
     <w:rsid w:val="00FC693F"/>
     <w:pPr>
       <w:spacing w:line="360" w:lineRule="auto" w:before="120" w:after="120"/>
-      <w:ind w:left="0" w:right="0" w:firstLine="0" w:hanging="0"/>
+      <w:ind w:left="0" w:right="0" w:firstLine="482"/>
       <w:jc w:val="both"/>
     </w:pPr>
     <w:rPr>
@@ -1534,7 +1535,7 @@
       <w:outlineLvl w:val="0"/>
     </w:pPr>
     <w:rPr>
-      <w:rFonts w:asciiTheme="majorHAnsi" w:eastAsiaTheme="majorEastAsia" w:hAnsiTheme="majorHAnsi" w:cstheme="majorBidi" w:ascii="Times New Roman" w:hAnsi="Times New Roman" w:eastAsia="Times New Roman" w:cs="Times New Roman"/>
+      <w:rFonts w:ascii="Times New Roman" w:hAnsi="Times New Roman" w:eastAsia="Times New Roman" w:cs="Times New Roman"/>
       <w:b/>
       <w:bCs/>
       <w:i w:val="0"/>
@@ -1560,7 +1561,7 @@
       <w:outlineLvl w:val="1"/>
     </w:pPr>
     <w:rPr>
-      <w:rFonts w:asciiTheme="majorHAnsi" w:eastAsiaTheme="majorEastAsia" w:hAnsiTheme="majorHAnsi" w:cstheme="majorBidi" w:ascii="Times New Roman" w:hAnsi="Times New Roman" w:eastAsia="Times New Roman" w:cs="Times New Roman"/>
+      <w:rFonts w:ascii="Times New Roman" w:hAnsi="Times New Roman" w:eastAsia="Times New Roman" w:cs="Times New Roman"/>
       <w:b/>
       <w:bCs/>
       <w:i w:val="0"/>
@@ -1586,7 +1587,7 @@
       <w:outlineLvl w:val="2"/>
     </w:pPr>
     <w:rPr>
-      <w:rFonts w:asciiTheme="majorHAnsi" w:eastAsiaTheme="majorEastAsia" w:hAnsiTheme="majorHAnsi" w:cstheme="majorBidi" w:ascii="Times New Roman" w:hAnsi="Times New Roman" w:eastAsia="Times New Roman" w:cs="Times New Roman"/>
+      <w:rFonts w:ascii="Times New Roman" w:hAnsi="Times New Roman" w:eastAsia="Times New Roman" w:cs="Times New Roman"/>
       <w:b/>
       <w:bCs/>
       <w:i w:val="0"/>

</xml_diff>